<commit_message>
Backend quan ly bai hoc
</commit_message>
<xml_diff>
--- a/PhamThuPhuong_221230960.docx
+++ b/PhamThuPhuong_221230960.docx
@@ -1621,6 +1621,13 @@
                 <w:szCs w:val="26"/>
               </w:rPr>
             </w:pPr>
+            <w:r>
+              <w:rPr>
+                <w:sz w:val="26"/>
+                <w:szCs w:val="26"/>
+              </w:rPr>
+              <w:t>Ok</w:t>
+            </w:r>
           </w:p>
         </w:tc>
       </w:tr>
@@ -1712,6 +1719,13 @@
                 <w:szCs w:val="26"/>
               </w:rPr>
             </w:pPr>
+            <w:r>
+              <w:rPr>
+                <w:sz w:val="26"/>
+                <w:szCs w:val="26"/>
+              </w:rPr>
+              <w:t>Ok</w:t>
+            </w:r>
           </w:p>
         </w:tc>
       </w:tr>

</xml_diff>